<commit_message>
docs(sentinel-s3-v21): extend trame, deck and Playwright QA for v2.1 surfaces
Document nav Securite/Reputation, Security Monitor and Veille sociale in the
presenter trame and deck, and extend the S3 Playwright harness with rail and
full-page surface assertions.

Co-authored-by: Cursor <cursoragent@cursor.com>
</commit_message>
<xml_diff>
--- a/docs/sentinel-ci-demo-trame-s3-presenter-card-2026-05-25.docx
+++ b/docs/sentinel-ci-demo-trame-s3-presenter-card-2026-05-25.docx
@@ -80,6 +80,22 @@
           <w:sz w:val="21"/>
         </w:rPr>
         <w:t>Le Scénario 3 s'enchaîne après la Décision Option B (S2.7). Cible : posture sécuritaire dual-axis avant le Conseil Défense restreint de 15h00.</w:t>
+      </w:r>
+    </w:p>
+    <w:p>
+      <w:pPr>
+        <w:pStyle w:val="ListBullet"/>
+        <w:spacing w:before="0" w:after="20" w:line="276" w:lineRule="auto"/>
+      </w:pPr>
+      <w:r>
+        <w:rPr>
+          <w:rFonts w:ascii="Calibri" w:hAnsi="Calibri" w:cs="Calibri" w:eastAsia="Calibri"/>
+          <w:b w:val="0"/>
+          <w:i w:val="0"/>
+          <w:color w:val="121822"/>
+          <w:sz w:val="21"/>
+        </w:rPr>
+        <w:t>Phase 2.1 : le rail principal expose Securite, Reputation et Veille sociale ; Security Monitor plein écran sur /securite/monitor.</w:t>
       </w:r>
     </w:p>
     <w:p>
@@ -244,7 +260,7 @@
           <w:color w:val="121822"/>
           <w:sz w:val="21"/>
         </w:rPr>
-        <w:t>Cockpit, bloc « Posture sécuritaire » mis en avant avec deux cartes Intérieur / Extérieur et la pastille « 15h00 — Conseil Défense restreint ».</w:t>
+        <w:t>Onglet Securite (rail principal) : posture dual-axis promue, barre sticky Conseil Defense 15h00, theatre Sahel ADS-B et chronologie rumeur inline.</w:t>
       </w:r>
     </w:p>
     <w:p>
@@ -269,7 +285,7 @@
           <w:color w:val="55606E"/>
           <w:sz w:val="21"/>
         </w:rPr>
-        <w:t>Sidebar gauche → chip « Posture sécuritaire » dans la barre de statut VP (ouvre directement le bloc).</w:t>
+        <w:t>Rail gauche → onglet Securite (ou cockpit → chip Posture securitaire).</w:t>
       </w:r>
     </w:p>
     <w:p>
@@ -353,7 +369,7 @@
           <w:color w:val="121822"/>
           <w:sz w:val="21"/>
         </w:rPr>
-        <w:t>Vue Stratégie, carte avec couche social-geo activée (points colorés sentiment) et drawer de droite affichant la liste des tweets groupés (officiels / citoyens / rumeur).</w:t>
+        <w:t>Page Veille sociale (/veille-sociale) : feed scrollable avec filtres bucket/sentiment, tri engagement et export CSV advisory.</w:t>
       </w:r>
     </w:p>
     <w:p>
@@ -378,7 +394,7 @@
           <w:color w:val="55606E"/>
           <w:sz w:val="21"/>
         </w:rPr>
-        <w:t>Carte Stratégie → bouton couche « Pulsation sociale » → drawer presse rouvert sur la pulsation.</w:t>
+        <w:t>Rail → Securite n/a · URL directe /hypervisor/mission-room/veille-sociale ou drawer pulsation depuis AYA.</w:t>
       </w:r>
     </w:p>
     <w:p>
@@ -571,7 +587,7 @@
           <w:color w:val="121822"/>
           <w:sz w:val="21"/>
         </w:rPr>
-        <w:t>Carte avec couches military-air (triangles) et border-tension actives, drawer « Snapshot ADS-B » listant les traces et zones de surveillance.</w:t>
+        <w:t>Security Monitor plein écran (/securite/monitor) : carte Sahel military-air + border-tension, alertes ADS-B, fil rumeur et signaux sociaux.</w:t>
       </w:r>
     </w:p>
     <w:p>
@@ -596,7 +612,7 @@
           <w:color w:val="55606E"/>
           <w:sz w:val="21"/>
         </w:rPr>
-        <w:t>Carte Stratégie → bouton couche « Trafic militaire » → drawer presse rouvert sur le snapshot ADS-B.</w:t>
+        <w:t>Onglet Securite → lien « Ouvrir Security Monitor » ou URL /hypervisor/mission-room/securite/monitor.</w:t>
       </w:r>
     </w:p>
     <w:p>
@@ -680,7 +696,7 @@
           <w:color w:val="121822"/>
           <w:sz w:val="21"/>
         </w:rPr>
-        <w:t>Vue Réputation, score 72 affiché, trois cartes drill : 2 vertes + 1 orange, lien direct vers l'article L'Inter.</w:t>
+        <w:t>Vue Reputation (rail principal), score 72 affiché, trois cartes drill : 2 vertes + 1 orange, lien direct vers l'article L'Inter.</w:t>
       </w:r>
     </w:p>
     <w:p>
@@ -705,7 +721,7 @@
           <w:color w:val="55606E"/>
           <w:sz w:val="21"/>
         </w:rPr>
-        <w:t>Sidebar → onglet Réputation → ancre « Drill 2+/1- » en bas de page.</w:t>
+        <w:t>Rail gauche → onglet Reputation → ancre « Drill 2+/1- » en bas de page.</w:t>
       </w:r>
     </w:p>
     <w:p>

</xml_diff>

<commit_message>
content(sentinel-s3): align presenter trame and deck S3 copy
</commit_message>
<xml_diff>
--- a/docs/sentinel-ci-demo-trame-s3-presenter-card-2026-05-25.docx
+++ b/docs/sentinel-ci-demo-trame-s3-presenter-card-2026-05-25.docx
@@ -95,7 +95,7 @@
           <w:color w:val="121822"/>
           <w:sz w:val="21"/>
         </w:rPr>
-        <w:t>Phase 2.1 : le rail principal expose Securite, Reputation et Veille sociale ; Security Monitor plein écran sur /securite/monitor.</w:t>
+        <w:t>Phase 2.1 : le rail principal expose Sécurité, Réputation et Veille sociale ; Security Monitor plein écran sur /securite/monitor.</w:t>
       </w:r>
     </w:p>
     <w:p>
@@ -235,7 +235,7 @@
           <w:color w:val="121822"/>
           <w:sz w:val="21"/>
         </w:rPr>
-        <w:t>« Posture dual-axis : intérieur vigilance, extérieur Sahel élevée. Prochain Conseil Défense restreint à 15h. »</w:t>
+        <w:t>« Monsieur le Vice-Président, posture en vigilance intérieure et élevée sur l'axe Sahel. La rumeur frontière Nord est démentie ; je prépare la lecture pour le Conseil Défense de 15h00. »</w:t>
       </w:r>
     </w:p>
     <w:p>
@@ -260,7 +260,7 @@
           <w:color w:val="121822"/>
           <w:sz w:val="21"/>
         </w:rPr>
-        <w:t>Onglet Securite (rail principal) : posture dual-axis promue, barre sticky Conseil Defense 15h00, theatre Sahel ADS-B et chronologie rumeur inline.</w:t>
+        <w:t>Onglet Sécurité (rail principal) : posture dual-axis promue, barre sticky Conseil Défense 15h00, théâtre Sahel ADS-B et chronologie rumeur inline.</w:t>
       </w:r>
     </w:p>
     <w:p>
@@ -285,7 +285,7 @@
           <w:color w:val="55606E"/>
           <w:sz w:val="21"/>
         </w:rPr>
-        <w:t>Rail gauche → onglet Securite (ou cockpit → chip Posture securitaire).</w:t>
+        <w:t>Rail gauche → onglet Sécurité (ou cockpit → chip Posture sécuritaire).</w:t>
       </w:r>
     </w:p>
     <w:p>
@@ -344,7 +344,7 @@
           <w:color w:val="121822"/>
           <w:sz w:val="21"/>
         </w:rPr>
-        <w:t>« 18 tweets sur la dernière heure : 5 officiels, 8 citoyens pseudonymisés, 5 signaux rumeur frontière. Snapshot demo-safe. »</w:t>
+        <w:t>« Monsieur le Vice-Président, j'affiche 18 signaux publics sur la séquence du jour : canaux vérifiés, citoyens pseudonymisés et rumeurs suivies. Le volume reste maîtrisé après les démentis officiels. »</w:t>
       </w:r>
     </w:p>
     <w:p>
@@ -369,7 +369,7 @@
           <w:color w:val="121822"/>
           <w:sz w:val="21"/>
         </w:rPr>
-        <w:t>Page Veille sociale (/veille-sociale) : feed scrollable avec filtres bucket/sentiment, tri engagement et export CSV advisory.</w:t>
+        <w:t>Page Veille sociale (/veille-sociale) : feed scrollable avec filtres périmètre/sentiment, tri engagement et export CSV advisory.</w:t>
       </w:r>
     </w:p>
     <w:p>
@@ -394,7 +394,7 @@
           <w:color w:val="55606E"/>
           <w:sz w:val="21"/>
         </w:rPr>
-        <w:t>Rail → Securite n/a · URL directe /hypervisor/mission-room/veille-sociale ou drawer pulsation depuis AYA.</w:t>
+        <w:t>URL directe /hypervisor/mission-room/veille-sociale ou drawer pulsation depuis AYA.</w:t>
       </w:r>
     </w:p>
     <w:p>
@@ -453,7 +453,7 @@
           <w:color w:val="121822"/>
           <w:sz w:val="21"/>
         </w:rPr>
-        <w:t>« Origine : tweet citoyen pseudonyme à 11h42 secteur Bouna. Repris sur Telegram à 12h08, blog régional à 12h48. Démentis officiels FANCI et Préfecture Nord publiés à 13h45. »</w:t>
+        <w:t>« Monsieur le Vice-Président, la rumeur part d'un tweet citoyen à 11h42, circule via Telegram et un blog, puis la FANCI dément à 13h46. La Préfecture Nord confirme à 13h52 ; je peux préparer le communiqué. »</w:t>
       </w:r>
     </w:p>
     <w:p>
@@ -562,7 +562,7 @@
           <w:color w:val="121822"/>
           <w:sz w:val="21"/>
         </w:rPr>
-        <w:t>« Snapshot ADS-B advisory : 10 traces sur l'axe Bamako, Ouagadougou, Niamey. 3 zones de surveillance OSINT, 2 bases CEDEAO en alerte standard. Lecture advisory only. »</w:t>
+        <w:t>« Monsieur le Vice-Président, j'affiche uniquement un snapshot ADS-B advisory : 10 traces publiques sur Bamako, Ouagadougou, Niamey et Abidjan. Aucun élément affiché ne constitue une confirmation opérationnelle. »</w:t>
       </w:r>
     </w:p>
     <w:p>
@@ -612,7 +612,7 @@
           <w:color w:val="55606E"/>
           <w:sz w:val="21"/>
         </w:rPr>
-        <w:t>Onglet Securite → lien « Ouvrir Security Monitor » ou URL /hypervisor/mission-room/securite/monitor.</w:t>
+        <w:t>Onglet Sécurité → lien « Ouvrir Security Monitor » ou URL /hypervisor/mission-room/securite/monitor.</w:t>
       </w:r>
     </w:p>
     <w:p>
@@ -671,7 +671,7 @@
           <w:color w:val="121822"/>
           <w:sz w:val="21"/>
         </w:rPr>
-        <w:t>« Score 72 sur 100, plus 4 points. Deux signaux positifs (Jeune Afrique, Fraternité Matin) compensent une critique de L'Inter sur le budget défense. »</w:t>
+        <w:t>« Monsieur le Vice-Président, le score réputation est à 72 sur 100 cette semaine. Deux lectures sont favorables, sur la séquence Nord et la réponse Nawa ; la critique à surveiller porte sur le budget défense. »</w:t>
       </w:r>
     </w:p>
     <w:p>
@@ -696,7 +696,7 @@
           <w:color w:val="121822"/>
           <w:sz w:val="21"/>
         </w:rPr>
-        <w:t>Vue Reputation (rail principal), score 72 affiché, trois cartes drill : 2 vertes + 1 orange, lien direct vers l'article L'Inter.</w:t>
+        <w:t>Vue Réputation (rail principal), score 72 affiché, trois cartes drill : 2 vertes + 1 orange, lien direct vers l'article L'Inter.</w:t>
       </w:r>
     </w:p>
     <w:p>
@@ -721,7 +721,7 @@
           <w:color w:val="55606E"/>
           <w:sz w:val="21"/>
         </w:rPr>
-        <w:t>Rail gauche → onglet Reputation → ancre « Drill 2+/1- » en bas de page.</w:t>
+        <w:t>Rail gauche → onglet Réputation → ancre « Drill 2+/1- » en bas de page.</w:t>
       </w:r>
     </w:p>
     <w:p>
@@ -755,7 +755,7 @@
           <w:color w:val="121822"/>
           <w:sz w:val="21"/>
         </w:rPr>
-        <w:t>« AYA, prépare un communiqué de sécurité sur la rumeur frontière Nord. »</w:t>
+        <w:t>« AYA, prépare un communiqué de sécurité sur la rumeur Nord. »</w:t>
       </w:r>
     </w:p>
     <w:p>
@@ -780,7 +780,7 @@
           <w:color w:val="121822"/>
           <w:sz w:val="21"/>
         </w:rPr>
-        <w:t>« Brouillon prêt : démenti officiel cité, posture FANCI rappelée, advisory only. Validation requise avant publication. »</w:t>
+        <w:t>« Monsieur le Vice-Président, je prépare un brouillon cabinet citant le démenti FANCI, la mise au point de la Préfecture Nord et la coordination CEDEAO. Le texte reste advisory et devra être validé avant diffusion. »</w:t>
       </w:r>
     </w:p>
     <w:p>
@@ -869,7 +869,7 @@
           <w:color w:val="121822"/>
           <w:sz w:val="19"/>
         </w:rPr>
-        <w:t>Lancer ``predemo_reset.sh`` à H-30 pour réinitialiser ``last_focus``, ``awaiting``, ``current_meeting`` et réactiver le pack ``sentinel_ci_aya_security_v1``.</w:t>
+        <w:t>Lancer ``predemo_reset.sh`` à H-30 pour réinitialiser l'état démo et revenir au point de départ S1/S2/S3.</w:t>
       </w:r>
     </w:p>
     <w:p>
@@ -933,7 +933,7 @@
           <w:color w:val="121822"/>
           <w:sz w:val="19"/>
         </w:rPr>
-        <w:t>Garde-fou rédactionnel : si la voix échoue, présenter en mode Quick Panel texte (même résolveur, même effet à l'écran).</w:t>
+        <w:t>Garde-fou rédactionnel : si la voix échoue, présenter en mode Quick Panel texte pour obtenir le même effet à l'écran.</w:t>
       </w:r>
     </w:p>
     <w:sectPr>

</xml_diff>